<commit_message>
Add automatic title normalization
</commit_message>
<xml_diff>
--- a/eBay_Collection_Schedule.docx
+++ b/eBay_Collection_Schedule.docx
@@ -17,7 +17,6 @@
       </w:r>
     </w:p>
     <w:p>
-      <w:proofErr w:type="spellStart"/>
       <w:r>
         <w:rPr>
           <w:i/>
@@ -25,17 +24,7 @@
           <w:sz w:val="24"/>
           <w:szCs w:val="24"/>
         </w:rPr>
-        <w:t>CollectionCalc</w:t>
-      </w:r>
-      <w:proofErr w:type="spellEnd"/>
-      <w:r>
-        <w:rPr>
-          <w:i/>
-          <w:iCs/>
-          <w:sz w:val="24"/>
-          <w:szCs w:val="24"/>
-        </w:rPr>
-        <w:t xml:space="preserve"> - Comic Sales Data Collection</w:t>
+        <w:t>CollectionCalc - Comic Sales Data Collection</w:t>
       </w:r>
     </w:p>
     <w:p/>
@@ -379,15 +368,7 @@
           </w:tcPr>
           <w:p>
             <w:r>
-              <w:t xml:space="preserve">First </w:t>
-            </w:r>
-            <w:proofErr w:type="gramStart"/>
-            <w:r>
-              <w:t>appearances, #</w:t>
-            </w:r>
-            <w:proofErr w:type="gramEnd"/>
-            <w:r>
-              <w:t>1s</w:t>
+              <w:t>First appearances, #1s</w:t>
             </w:r>
           </w:p>
         </w:tc>
@@ -549,13 +530,8 @@
           </w:tcPr>
           <w:p>
             <w:r>
-              <w:t xml:space="preserve">Horror, licensed, </w:t>
-            </w:r>
-            <w:proofErr w:type="spellStart"/>
-            <w:r>
-              <w:t>misc</w:t>
-            </w:r>
-            <w:proofErr w:type="spellEnd"/>
+              <w:t>Horror, licensed, misc</w:t>
+            </w:r>
           </w:p>
         </w:tc>
       </w:tr>
@@ -1351,15 +1327,7 @@
           </w:tcPr>
           <w:p>
             <w:r>
-              <w:t xml:space="preserve">33. </w:t>
-            </w:r>
-            <w:proofErr w:type="spellStart"/>
-            <w:r>
-              <w:t>Ms</w:t>
-            </w:r>
-            <w:proofErr w:type="spellEnd"/>
-            <w:r>
-              <w:t xml:space="preserve"> Marvel Kamala</w:t>
+              <w:t>33. Ms Marvel Kamala</w:t>
             </w:r>
           </w:p>
         </w:tc>
@@ -1672,13 +1640,8 @@
           </w:tcPr>
           <w:p>
             <w:r>
-              <w:t xml:space="preserve">11. </w:t>
-            </w:r>
-            <w:proofErr w:type="spellStart"/>
-            <w:r>
-              <w:t>Nightwing</w:t>
-            </w:r>
-            <w:proofErr w:type="spellEnd"/>
+              <w:t>11. Nightwing</w:t>
+            </w:r>
           </w:p>
         </w:tc>
         <w:tc>
@@ -2251,7 +2214,7 @@
       <w:tr>
         <w:tc>
           <w:tcPr>
-            <w:tcW w:w="4680" w:type="dxa"/>
+            <w:tcW w:w="4679" w:type="dxa"/>
             <w:tcBorders>
               <w:top w:val="single" w:sz="1" w:space="0" w:color="999999"/>
               <w:left w:val="single" w:sz="1" w:space="0" w:color="999999"/>
@@ -2273,7 +2236,7 @@
         </w:tc>
         <w:tc>
           <w:tcPr>
-            <w:tcW w:w="4680" w:type="dxa"/>
+            <w:tcW w:w="4679" w:type="dxa"/>
             <w:tcBorders>
               <w:top w:val="single" w:sz="1" w:space="0" w:color="999999"/>
               <w:left w:val="single" w:sz="1" w:space="0" w:color="999999"/>
@@ -2297,7 +2260,7 @@
       <w:tr>
         <w:tc>
           <w:tcPr>
-            <w:tcW w:w="4680" w:type="dxa"/>
+            <w:tcW w:w="4679" w:type="dxa"/>
             <w:tcBorders>
               <w:top w:val="single" w:sz="1" w:space="0" w:color="999999"/>
               <w:left w:val="single" w:sz="1" w:space="0" w:color="999999"/>
@@ -2319,7 +2282,7 @@
         </w:tc>
         <w:tc>
           <w:tcPr>
-            <w:tcW w:w="4680" w:type="dxa"/>
+            <w:tcW w:w="4679" w:type="dxa"/>
             <w:tcBorders>
               <w:top w:val="single" w:sz="1" w:space="0" w:color="999999"/>
               <w:left w:val="single" w:sz="1" w:space="0" w:color="999999"/>
@@ -2343,7 +2306,7 @@
       <w:tr>
         <w:tc>
           <w:tcPr>
-            <w:tcW w:w="4680" w:type="dxa"/>
+            <w:tcW w:w="4679" w:type="dxa"/>
             <w:tcBorders>
               <w:top w:val="single" w:sz="1" w:space="0" w:color="999999"/>
               <w:left w:val="single" w:sz="1" w:space="0" w:color="999999"/>
@@ -2365,7 +2328,7 @@
         </w:tc>
         <w:tc>
           <w:tcPr>
-            <w:tcW w:w="4680" w:type="dxa"/>
+            <w:tcW w:w="4679" w:type="dxa"/>
             <w:tcBorders>
               <w:top w:val="single" w:sz="1" w:space="0" w:color="999999"/>
               <w:left w:val="single" w:sz="1" w:space="0" w:color="999999"/>
@@ -2389,7 +2352,7 @@
       <w:tr>
         <w:tc>
           <w:tcPr>
-            <w:tcW w:w="4680" w:type="dxa"/>
+            <w:tcW w:w="4679" w:type="dxa"/>
             <w:tcBorders>
               <w:top w:val="single" w:sz="1" w:space="0" w:color="999999"/>
               <w:left w:val="single" w:sz="1" w:space="0" w:color="999999"/>
@@ -2411,36 +2374,31 @@
         </w:tc>
         <w:tc>
           <w:tcPr>
-            <w:tcW w:w="4680" w:type="dxa"/>
-            <w:tcBorders>
-              <w:top w:val="single" w:sz="1" w:space="0" w:color="999999"/>
-              <w:left w:val="single" w:sz="1" w:space="0" w:color="999999"/>
-              <w:bottom w:val="single" w:sz="1" w:space="0" w:color="999999"/>
-              <w:right w:val="single" w:sz="1" w:space="0" w:color="999999"/>
-            </w:tcBorders>
-            <w:tcMar>
-              <w:top w:w="40" w:type="dxa"/>
-              <w:left w:w="80" w:type="dxa"/>
-              <w:bottom w:w="40" w:type="dxa"/>
-              <w:right w:w="80" w:type="dxa"/>
-            </w:tcMar>
-          </w:tcPr>
-          <w:p>
-            <w:r>
-              <w:t xml:space="preserve">8. </w:t>
-            </w:r>
-            <w:proofErr w:type="spellStart"/>
-            <w:r>
-              <w:t>Witchblade</w:t>
-            </w:r>
-            <w:proofErr w:type="spellEnd"/>
-          </w:p>
-        </w:tc>
-      </w:tr>
-      <w:tr>
-        <w:tc>
-          <w:tcPr>
-            <w:tcW w:w="4680" w:type="dxa"/>
+            <w:tcW w:w="4679" w:type="dxa"/>
+            <w:tcBorders>
+              <w:top w:val="single" w:sz="1" w:space="0" w:color="999999"/>
+              <w:left w:val="single" w:sz="1" w:space="0" w:color="999999"/>
+              <w:bottom w:val="single" w:sz="1" w:space="0" w:color="999999"/>
+              <w:right w:val="single" w:sz="1" w:space="0" w:color="999999"/>
+            </w:tcBorders>
+            <w:tcMar>
+              <w:top w:w="40" w:type="dxa"/>
+              <w:left w:w="80" w:type="dxa"/>
+              <w:bottom w:w="40" w:type="dxa"/>
+              <w:right w:w="80" w:type="dxa"/>
+            </w:tcMar>
+          </w:tcPr>
+          <w:p>
+            <w:r>
+              <w:t>8. Witchblade</w:t>
+            </w:r>
+          </w:p>
+        </w:tc>
+      </w:tr>
+      <w:tr>
+        <w:tc>
+          <w:tcPr>
+            <w:tcW w:w="4679" w:type="dxa"/>
             <w:tcBorders>
               <w:top w:val="single" w:sz="1" w:space="0" w:color="999999"/>
               <w:left w:val="single" w:sz="1" w:space="0" w:color="999999"/>
@@ -2462,7 +2420,7 @@
         </w:tc>
         <w:tc>
           <w:tcPr>
-            <w:tcW w:w="4680" w:type="dxa"/>
+            <w:tcW w:w="4679" w:type="dxa"/>
             <w:tcBorders>
               <w:top w:val="single" w:sz="1" w:space="0" w:color="999999"/>
               <w:left w:val="single" w:sz="1" w:space="0" w:color="999999"/>
@@ -2486,39 +2444,29 @@
       <w:tr>
         <w:tc>
           <w:tcPr>
-            <w:tcW w:w="4680" w:type="dxa"/>
-            <w:tcBorders>
-              <w:top w:val="single" w:sz="1" w:space="0" w:color="999999"/>
-              <w:left w:val="single" w:sz="1" w:space="0" w:color="999999"/>
-              <w:bottom w:val="single" w:sz="1" w:space="0" w:color="999999"/>
-              <w:right w:val="single" w:sz="1" w:space="0" w:color="999999"/>
-            </w:tcBorders>
-            <w:tcMar>
-              <w:top w:w="40" w:type="dxa"/>
-              <w:left w:w="80" w:type="dxa"/>
-              <w:bottom w:w="40" w:type="dxa"/>
-              <w:right w:w="80" w:type="dxa"/>
-            </w:tcMar>
-          </w:tcPr>
-          <w:p>
-            <w:r>
-              <w:t xml:space="preserve">11. </w:t>
-            </w:r>
-            <w:proofErr w:type="spellStart"/>
-            <w:r>
-              <w:t>WildC.A.</w:t>
-            </w:r>
-            <w:proofErr w:type="gramStart"/>
-            <w:r>
-              <w:t>T.S</w:t>
-            </w:r>
-            <w:proofErr w:type="spellEnd"/>
-            <w:proofErr w:type="gramEnd"/>
-          </w:p>
-        </w:tc>
-        <w:tc>
-          <w:tcPr>
-            <w:tcW w:w="4680" w:type="dxa"/>
+            <w:tcW w:w="4679" w:type="dxa"/>
+            <w:tcBorders>
+              <w:top w:val="single" w:sz="1" w:space="0" w:color="999999"/>
+              <w:left w:val="single" w:sz="1" w:space="0" w:color="999999"/>
+              <w:bottom w:val="single" w:sz="1" w:space="0" w:color="999999"/>
+              <w:right w:val="single" w:sz="1" w:space="0" w:color="999999"/>
+            </w:tcBorders>
+            <w:tcMar>
+              <w:top w:w="40" w:type="dxa"/>
+              <w:left w:w="80" w:type="dxa"/>
+              <w:bottom w:w="40" w:type="dxa"/>
+              <w:right w:w="80" w:type="dxa"/>
+            </w:tcMar>
+          </w:tcPr>
+          <w:p>
+            <w:r>
+              <w:t>11. WildC.A.T.S</w:t>
+            </w:r>
+          </w:p>
+        </w:tc>
+        <w:tc>
+          <w:tcPr>
+            <w:tcW w:w="4679" w:type="dxa"/>
             <w:tcBorders>
               <w:top w:val="single" w:sz="1" w:space="0" w:color="999999"/>
               <w:left w:val="single" w:sz="1" w:space="0" w:color="999999"/>
@@ -2542,7 +2490,7 @@
       <w:tr>
         <w:tc>
           <w:tcPr>
-            <w:tcW w:w="4680" w:type="dxa"/>
+            <w:tcW w:w="4679" w:type="dxa"/>
             <w:tcBorders>
               <w:top w:val="single" w:sz="1" w:space="0" w:color="999999"/>
               <w:left w:val="single" w:sz="1" w:space="0" w:color="999999"/>
@@ -2564,7 +2512,7 @@
         </w:tc>
         <w:tc>
           <w:tcPr>
-            <w:tcW w:w="4680" w:type="dxa"/>
+            <w:tcW w:w="4679" w:type="dxa"/>
             <w:tcBorders>
               <w:top w:val="single" w:sz="1" w:space="0" w:color="999999"/>
               <w:left w:val="single" w:sz="1" w:space="0" w:color="999999"/>
@@ -2588,7 +2536,7 @@
       <w:tr>
         <w:tc>
           <w:tcPr>
-            <w:tcW w:w="4680" w:type="dxa"/>
+            <w:tcW w:w="4679" w:type="dxa"/>
             <w:tcBorders>
               <w:top w:val="single" w:sz="1" w:space="0" w:color="999999"/>
               <w:left w:val="single" w:sz="1" w:space="0" w:color="999999"/>
@@ -2610,7 +2558,7 @@
         </w:tc>
         <w:tc>
           <w:tcPr>
-            <w:tcW w:w="4680" w:type="dxa"/>
+            <w:tcW w:w="4679" w:type="dxa"/>
             <w:tcBorders>
               <w:top w:val="single" w:sz="1" w:space="0" w:color="999999"/>
               <w:left w:val="single" w:sz="1" w:space="0" w:color="999999"/>
@@ -2634,7 +2582,7 @@
       <w:tr>
         <w:tc>
           <w:tcPr>
-            <w:tcW w:w="4680" w:type="dxa"/>
+            <w:tcW w:w="4679" w:type="dxa"/>
             <w:tcBorders>
               <w:top w:val="single" w:sz="1" w:space="0" w:color="999999"/>
               <w:left w:val="single" w:sz="1" w:space="0" w:color="999999"/>
@@ -2656,7 +2604,7 @@
         </w:tc>
         <w:tc>
           <w:tcPr>
-            <w:tcW w:w="4680" w:type="dxa"/>
+            <w:tcW w:w="4679" w:type="dxa"/>
             <w:tcBorders>
               <w:top w:val="single" w:sz="1" w:space="0" w:color="999999"/>
               <w:left w:val="single" w:sz="1" w:space="0" w:color="999999"/>
@@ -2680,7 +2628,7 @@
       <w:tr>
         <w:tc>
           <w:tcPr>
-            <w:tcW w:w="4680" w:type="dxa"/>
+            <w:tcW w:w="4679" w:type="dxa"/>
             <w:tcBorders>
               <w:top w:val="single" w:sz="1" w:space="0" w:color="999999"/>
               <w:left w:val="single" w:sz="1" w:space="0" w:color="999999"/>
@@ -2702,7 +2650,7 @@
         </w:tc>
         <w:tc>
           <w:tcPr>
-            <w:tcW w:w="4680" w:type="dxa"/>
+            <w:tcW w:w="4679" w:type="dxa"/>
             <w:tcBorders>
               <w:top w:val="single" w:sz="1" w:space="0" w:color="999999"/>
               <w:left w:val="single" w:sz="1" w:space="0" w:color="999999"/>
@@ -2726,7 +2674,7 @@
       <w:tr>
         <w:tc>
           <w:tcPr>
-            <w:tcW w:w="4680" w:type="dxa"/>
+            <w:tcW w:w="4679" w:type="dxa"/>
             <w:tcBorders>
               <w:top w:val="single" w:sz="1" w:space="0" w:color="999999"/>
               <w:left w:val="single" w:sz="1" w:space="0" w:color="999999"/>
@@ -2748,7 +2696,7 @@
         </w:tc>
         <w:tc>
           <w:tcPr>
-            <w:tcW w:w="4680" w:type="dxa"/>
+            <w:tcW w:w="4679" w:type="dxa"/>
             <w:tcBorders>
               <w:top w:val="single" w:sz="1" w:space="0" w:color="999999"/>
               <w:left w:val="single" w:sz="1" w:space="0" w:color="999999"/>
@@ -2772,7 +2720,7 @@
       <w:tr>
         <w:tc>
           <w:tcPr>
-            <w:tcW w:w="4680" w:type="dxa"/>
+            <w:tcW w:w="4679" w:type="dxa"/>
             <w:tcBorders>
               <w:top w:val="single" w:sz="1" w:space="0" w:color="999999"/>
               <w:left w:val="single" w:sz="1" w:space="0" w:color="999999"/>
@@ -2794,7 +2742,7 @@
         </w:tc>
         <w:tc>
           <w:tcPr>
-            <w:tcW w:w="4680" w:type="dxa"/>
+            <w:tcW w:w="4679" w:type="dxa"/>
             <w:tcBorders>
               <w:top w:val="single" w:sz="1" w:space="0" w:color="999999"/>
               <w:left w:val="single" w:sz="1" w:space="0" w:color="999999"/>
@@ -2818,7 +2766,7 @@
       <w:tr>
         <w:tc>
           <w:tcPr>
-            <w:tcW w:w="4680" w:type="dxa"/>
+            <w:tcW w:w="4679" w:type="dxa"/>
             <w:tcBorders>
               <w:top w:val="single" w:sz="1" w:space="0" w:color="999999"/>
               <w:left w:val="single" w:sz="1" w:space="0" w:color="999999"/>
@@ -2840,7 +2788,7 @@
         </w:tc>
         <w:tc>
           <w:tcPr>
-            <w:tcW w:w="4680" w:type="dxa"/>
+            <w:tcW w:w="4679" w:type="dxa"/>
             <w:tcBorders>
               <w:top w:val="single" w:sz="1" w:space="0" w:color="999999"/>
               <w:left w:val="single" w:sz="1" w:space="0" w:color="999999"/>
@@ -2864,7 +2812,7 @@
       <w:tr>
         <w:tc>
           <w:tcPr>
-            <w:tcW w:w="4680" w:type="dxa"/>
+            <w:tcW w:w="4679" w:type="dxa"/>
             <w:tcBorders>
               <w:top w:val="single" w:sz="1" w:space="0" w:color="999999"/>
               <w:left w:val="single" w:sz="1" w:space="0" w:color="999999"/>
@@ -2886,7 +2834,7 @@
         </w:tc>
         <w:tc>
           <w:tcPr>
-            <w:tcW w:w="4680" w:type="dxa"/>
+            <w:tcW w:w="4679" w:type="dxa"/>
             <w:tcBorders>
               <w:top w:val="single" w:sz="1" w:space="0" w:color="999999"/>
               <w:left w:val="single" w:sz="1" w:space="0" w:color="999999"/>
@@ -2910,7 +2858,7 @@
       <w:tr>
         <w:tc>
           <w:tcPr>
-            <w:tcW w:w="4680" w:type="dxa"/>
+            <w:tcW w:w="4679" w:type="dxa"/>
             <w:tcBorders>
               <w:top w:val="single" w:sz="1" w:space="0" w:color="999999"/>
               <w:left w:val="single" w:sz="1" w:space="0" w:color="999999"/>
@@ -2932,7 +2880,7 @@
         </w:tc>
         <w:tc>
           <w:tcPr>
-            <w:tcW w:w="4680" w:type="dxa"/>
+            <w:tcW w:w="4679" w:type="dxa"/>
             <w:tcBorders>
               <w:top w:val="single" w:sz="1" w:space="0" w:color="999999"/>
               <w:left w:val="single" w:sz="1" w:space="0" w:color="999999"/>
@@ -2956,7 +2904,7 @@
       <w:tr>
         <w:tc>
           <w:tcPr>
-            <w:tcW w:w="4680" w:type="dxa"/>
+            <w:tcW w:w="4679" w:type="dxa"/>
             <w:tcBorders>
               <w:top w:val="single" w:sz="1" w:space="0" w:color="999999"/>
               <w:left w:val="single" w:sz="1" w:space="0" w:color="999999"/>
@@ -2978,7 +2926,7 @@
         </w:tc>
         <w:tc>
           <w:tcPr>
-            <w:tcW w:w="4680" w:type="dxa"/>
+            <w:tcW w:w="4679" w:type="dxa"/>
             <w:tcBorders>
               <w:top w:val="single" w:sz="1" w:space="0" w:color="999999"/>
               <w:left w:val="single" w:sz="1" w:space="0" w:color="999999"/>
@@ -3002,7 +2950,7 @@
       <w:tr>
         <w:tc>
           <w:tcPr>
-            <w:tcW w:w="4680" w:type="dxa"/>
+            <w:tcW w:w="4679" w:type="dxa"/>
             <w:tcBorders>
               <w:top w:val="single" w:sz="1" w:space="0" w:color="999999"/>
               <w:left w:val="single" w:sz="1" w:space="0" w:color="999999"/>
@@ -3024,7 +2972,7 @@
         </w:tc>
         <w:tc>
           <w:tcPr>
-            <w:tcW w:w="4680" w:type="dxa"/>
+            <w:tcW w:w="4679" w:type="dxa"/>
             <w:tcBorders>
               <w:top w:val="single" w:sz="1" w:space="0" w:color="999999"/>
               <w:left w:val="single" w:sz="1" w:space="0" w:color="999999"/>
@@ -3043,6 +2991,48 @@
               <w:t>34. Fire Power</w:t>
             </w:r>
           </w:p>
+        </w:tc>
+      </w:tr>
+      <w:tr>
+        <w:tc>
+          <w:tcPr>
+            <w:tcW w:w="4679" w:type="dxa"/>
+            <w:tcBorders>
+              <w:top w:val="single" w:sz="1" w:space="0" w:color="999999"/>
+              <w:left w:val="single" w:sz="1" w:space="0" w:color="999999"/>
+              <w:bottom w:val="single" w:sz="1" w:space="0" w:color="999999"/>
+              <w:right w:val="single" w:sz="1" w:space="0" w:color="999999"/>
+            </w:tcBorders>
+            <w:tcMar>
+              <w:top w:w="40" w:type="dxa"/>
+              <w:left w:w="80" w:type="dxa"/>
+              <w:bottom w:w="40" w:type="dxa"/>
+              <w:right w:w="80" w:type="dxa"/>
+            </w:tcMar>
+          </w:tcPr>
+          <w:p>
+            <w:r>
+              <w:t>35. D’Orc</w:t>
+            </w:r>
+          </w:p>
+        </w:tc>
+        <w:tc>
+          <w:tcPr>
+            <w:tcW w:w="4679" w:type="dxa"/>
+            <w:tcBorders>
+              <w:top w:val="single" w:sz="1" w:space="0" w:color="999999"/>
+              <w:left w:val="single" w:sz="1" w:space="0" w:color="999999"/>
+              <w:bottom w:val="single" w:sz="1" w:space="0" w:color="999999"/>
+              <w:right w:val="single" w:sz="1" w:space="0" w:color="999999"/>
+            </w:tcBorders>
+            <w:tcMar>
+              <w:top w:w="40" w:type="dxa"/>
+              <w:left w:w="80" w:type="dxa"/>
+              <w:bottom w:w="40" w:type="dxa"/>
+              <w:right w:w="80" w:type="dxa"/>
+            </w:tcMar>
+          </w:tcPr>
+          <w:p/>
         </w:tc>
       </w:tr>
     </w:tbl>
@@ -3377,6 +3367,7 @@
           </w:tcPr>
           <w:p>
             <w:r>
+              <w:lastRenderedPageBreak/>
               <w:t>13. Journey Into Mystery 83</w:t>
             </w:r>
           </w:p>
@@ -3423,7 +3414,6 @@
           </w:tcPr>
           <w:p>
             <w:r>
-              <w:lastRenderedPageBreak/>
               <w:t>15. Strange Tales 110</w:t>
             </w:r>
           </w:p>
@@ -3656,15 +3646,6 @@
             <w:r>
               <w:t>25. X-Men 266</w:t>
             </w:r>
-            <w:r>
-              <w:t xml:space="preserve"> </w:t>
-            </w:r>
-            <w:r>
-              <w:rPr>
-                <w:color w:val="EE0000"/>
-              </w:rPr>
-              <w:t>[2/5/26 stopped here]</w:t>
-            </w:r>
           </w:p>
         </w:tc>
         <w:tc>
@@ -3777,47 +3758,31 @@
           </w:tcPr>
           <w:p>
             <w:r>
-              <w:t xml:space="preserve">30. </w:t>
-            </w:r>
-            <w:proofErr w:type="spellStart"/>
-            <w:r>
-              <w:t>Cerebus</w:t>
-            </w:r>
-            <w:proofErr w:type="spellEnd"/>
-            <w:r>
-              <w:t xml:space="preserve"> 1</w:t>
-            </w:r>
-          </w:p>
-        </w:tc>
-      </w:tr>
-      <w:tr>
-        <w:tc>
-          <w:tcPr>
-            <w:tcW w:w="4680" w:type="dxa"/>
-            <w:tcBorders>
-              <w:top w:val="single" w:sz="1" w:space="0" w:color="999999"/>
-              <w:left w:val="single" w:sz="1" w:space="0" w:color="999999"/>
-              <w:bottom w:val="single" w:sz="1" w:space="0" w:color="999999"/>
-              <w:right w:val="single" w:sz="1" w:space="0" w:color="999999"/>
-            </w:tcBorders>
-            <w:tcMar>
-              <w:top w:w="40" w:type="dxa"/>
-              <w:left w:w="80" w:type="dxa"/>
-              <w:bottom w:w="40" w:type="dxa"/>
-              <w:right w:w="80" w:type="dxa"/>
-            </w:tcMar>
-          </w:tcPr>
-          <w:p>
-            <w:r>
-              <w:t xml:space="preserve">31. </w:t>
-            </w:r>
-            <w:proofErr w:type="spellStart"/>
-            <w:r>
-              <w:t>Elfquest</w:t>
-            </w:r>
-            <w:proofErr w:type="spellEnd"/>
-            <w:r>
-              <w:t xml:space="preserve"> 1</w:t>
+              <w:t>30. Cerebus 1</w:t>
+            </w:r>
+          </w:p>
+        </w:tc>
+      </w:tr>
+      <w:tr>
+        <w:tc>
+          <w:tcPr>
+            <w:tcW w:w="4680" w:type="dxa"/>
+            <w:tcBorders>
+              <w:top w:val="single" w:sz="1" w:space="0" w:color="999999"/>
+              <w:left w:val="single" w:sz="1" w:space="0" w:color="999999"/>
+              <w:bottom w:val="single" w:sz="1" w:space="0" w:color="999999"/>
+              <w:right w:val="single" w:sz="1" w:space="0" w:color="999999"/>
+            </w:tcBorders>
+            <w:tcMar>
+              <w:top w:w="40" w:type="dxa"/>
+              <w:left w:w="80" w:type="dxa"/>
+              <w:bottom w:w="40" w:type="dxa"/>
+              <w:right w:w="80" w:type="dxa"/>
+            </w:tcMar>
+          </w:tcPr>
+          <w:p>
+            <w:r>
+              <w:t>31. Elfquest 1</w:t>
             </w:r>
           </w:p>
         </w:tc>
@@ -5087,6 +5052,7 @@
           </w:tcPr>
           <w:p>
             <w:r>
+              <w:lastRenderedPageBreak/>
               <w:t>15. Alan Moore</w:t>
             </w:r>
           </w:p>
@@ -5133,7 +5099,6 @@
           </w:tcPr>
           <w:p>
             <w:r>
-              <w:lastRenderedPageBreak/>
               <w:t>17. Warren Ellis</w:t>
             </w:r>
           </w:p>
@@ -5478,13 +5443,8 @@
           </w:tcPr>
           <w:p>
             <w:r>
-              <w:t xml:space="preserve">32. James </w:t>
-            </w:r>
-            <w:proofErr w:type="spellStart"/>
-            <w:r>
-              <w:t>Tynion</w:t>
-            </w:r>
-            <w:proofErr w:type="spellEnd"/>
+              <w:t>32. James Tynion</w:t>
+            </w:r>
           </w:p>
         </w:tc>
       </w:tr>
@@ -5774,13 +5734,8 @@
           </w:tcPr>
           <w:p>
             <w:r>
-              <w:t xml:space="preserve">9. </w:t>
-            </w:r>
-            <w:proofErr w:type="spellStart"/>
-            <w:r>
-              <w:t>Hellblazer</w:t>
-            </w:r>
-            <w:proofErr w:type="spellEnd"/>
+              <w:t>9. Hellblazer</w:t>
+            </w:r>
           </w:p>
         </w:tc>
         <w:tc>
@@ -5893,13 +5848,8 @@
           </w:tcPr>
           <w:p>
             <w:r>
-              <w:t xml:space="preserve">14. </w:t>
-            </w:r>
-            <w:proofErr w:type="spellStart"/>
-            <w:r>
-              <w:t>Hellboy</w:t>
-            </w:r>
-            <w:proofErr w:type="spellEnd"/>
+              <w:t>14. Hellboy</w:t>
+            </w:r>
           </w:p>
         </w:tc>
       </w:tr>
@@ -6290,13 +6240,8 @@
           </w:tcPr>
           <w:p>
             <w:r>
-              <w:t xml:space="preserve">31. </w:t>
-            </w:r>
-            <w:proofErr w:type="spellStart"/>
-            <w:r>
-              <w:t>Vampirella</w:t>
-            </w:r>
-            <w:proofErr w:type="spellEnd"/>
+              <w:t>31. Vampirella</w:t>
+            </w:r>
           </w:p>
         </w:tc>
         <w:tc>
@@ -6363,13 +6308,8 @@
           </w:tcPr>
           <w:p>
             <w:r>
-              <w:t xml:space="preserve">34. </w:t>
-            </w:r>
-            <w:proofErr w:type="spellStart"/>
-            <w:r>
-              <w:t>Pokemon</w:t>
-            </w:r>
-            <w:proofErr w:type="spellEnd"/>
+              <w:t>34. Pokemon</w:t>
+            </w:r>
           </w:p>
         </w:tc>
       </w:tr>

</xml_diff>